<commit_message>
Clarify manual review ownership in final report
</commit_message>
<xml_diff>
--- a/docs/Final-Report-Kang Xingyao.docx
+++ b/docs/Final-Report-Kang Xingyao.docx
@@ -448,12 +448,7 @@
         </w:rPr>
       </w:pPr>
       <w:r>
-        <w:rPr>
-          <w:rFonts w:hint="default" w:ascii="Times New Roman Regular" w:hAnsi="Times New Roman Regular" w:cs="Times New Roman Regular"/>
-          <w:sz w:val="24"/>
-          <w:szCs w:val="24"/>
-        </w:rPr>
-        <w:t>Answer quality is therefore scored separately. A retrospective AI-assisted review assessed 25 eligible saved policy answers, while a documented student manual spot check assessed a stratified random sample of 10. The manual review is evidence of a student check, not independent HR validation. The saved live run used the revised prompt draft-intent-v2; five workflow cases were handled locally and 25 used the model without recorded API errors.</w:t>
+        <w:t>Answer quality is therefore scored separately. A retrospective AI-assisted review assessed 25 eligible saved policy answers, while I conducted a documented manual spot check of a stratified random sample of 10 answers. This check is evidence of my review, not independent HR validation. The saved live run used the revised prompt draft-intent-v2; five workflow cases were handled locally and 25 used the model without recorded API errors.</w:t>
       </w:r>
     </w:p>
     <w:p>

</xml_diff>

<commit_message>
Align report API and manual review wording
</commit_message>
<xml_diff>
--- a/docs/Final-Report-Kang Xingyao.docx
+++ b/docs/Final-Report-Kang Xingyao.docx
@@ -254,12 +254,7 @@
         </w:rPr>
       </w:pPr>
       <w:r>
-        <w:rPr>
-          <w:rFonts w:hint="default" w:ascii="Times New Roman Regular" w:hAnsi="Times New Roman Regular" w:cs="Times New Roman Regular"/>
-          <w:sz w:val="24"/>
-          <w:szCs w:val="24"/>
-        </w:rPr>
-        <w:t>The local baseline uses Chinese bigrams, English tokens, aliases, TF-IDF and cosine similarity to retrieve up to three policy sections. In optional OpenRouter mode, openai/gpt-4o-mini receives the retrieved evidence and returns answer text, citation IDs and an intent. Python retains control of field extraction and validation. The model has no tool that can execute personnel actions. This build-and-buy split keeps policy handling inspectable while renting language generation rather than training a model for five fictional documents.</w:t>
+        <w:t>The local baseline uses Chinese bigrams, English tokens, aliases, TF-IDF and cosine similarity to retrieve up to three policy sections. In the OpenRouter API model mode used in the recorded demonstration, openai/gpt-4o-mini receives the retrieved evidence and returns answer text, citation IDs and an intent. Python retains control of field extraction and validation. The model has no tool that can execute personnel actions. This build-and-buy split keeps policy handling inspectable while renting language generation rather than training a model for five fictional documents.</w:t>
       </w:r>
     </w:p>
     <w:p>
@@ -448,7 +443,7 @@
         </w:rPr>
       </w:pPr>
       <w:r>
-        <w:t>Answer quality is therefore scored separately. A retrospective AI-assisted review assessed 25 eligible saved policy answers, while I conducted a documented manual spot check of a stratified random sample of 10 answers. This check is evidence of my review, not independent HR validation. The saved live run used the revised prompt draft-intent-v2; five workflow cases were handled locally and 25 used the model without recorded API errors.</w:t>
+        <w:t>Answer quality is therefore scored separately. A retrospective AI-assisted review assessed 25 eligible saved policy answers, while I conducted a documented manual spot check of a stratified random sample of 10 answers. This documented check shows that I reviewed the sample; it is not independent HR validation. The saved live run used the revised prompt draft-intent-v2; five workflow cases were handled locally and 25 used the model without recorded API errors.</w:t>
       </w:r>
     </w:p>
     <w:p>
@@ -966,22 +961,8 @@
             <w:vAlign w:val="center"/>
           </w:tcPr>
           <w:p>
-            <w:pPr>
-              <w:spacing w:line="360" w:lineRule="auto"/>
-              <w:jc w:val="both"/>
-              <w:rPr>
-                <w:rFonts w:hint="default" w:ascii="Times New Roman Regular" w:hAnsi="Times New Roman Regular" w:cs="Times New Roman Regular"/>
-                <w:sz w:val="24"/>
-                <w:szCs w:val="24"/>
-              </w:rPr>
-            </w:pPr>
             <w:r>
-              <w:rPr>
-                <w:rFonts w:hint="default" w:ascii="Times New Roman Regular" w:hAnsi="Times New Roman Regular" w:cs="Times New Roman Regular"/>
-                <w:sz w:val="24"/>
-                <w:szCs w:val="24"/>
-              </w:rPr>
-              <w:t>Manual student spot check</w:t>
+              <w:t>My manual spot check</w:t>
             </w:r>
           </w:p>
         </w:tc>
@@ -1533,90 +1514,9 @@
         </w:rPr>
       </w:pPr>
       <w:r>
-        <w:rPr>
-          <w:rFonts w:hint="default" w:ascii="Times New Roman Regular" w:hAnsi="Times New Roman Regular" w:cs="Times New Roman Regular"/>
-          <w:b w:val="0"/>
-          <w:sz w:val="24"/>
-          <w:szCs w:val="24"/>
-        </w:rPr>
-        <w:t xml:space="preserve">The repository contains the policy corpus, labelled test cases, frozen evidence, source code, BPMN workflow and English demo video. The README defines the intended user, inputs, outputs, safety boundary and local setup. Repository: </w:t>
-      </w:r>
-      <w:r>
-        <w:rPr>
-          <w:rFonts w:hint="default" w:ascii="Times New Roman Bold" w:hAnsi="Times New Roman Bold" w:cs="Times New Roman Bold"/>
-          <w:b/>
-          <w:bCs w:val="0"/>
-          <w:color w:val="auto"/>
-          <w:sz w:val="24"/>
-          <w:szCs w:val="24"/>
-        </w:rPr>
-        <w:fldChar w:fldCharType="begin"/>
-      </w:r>
-      <w:r>
-        <w:rPr>
-          <w:rFonts w:hint="default" w:ascii="Times New Roman Bold" w:hAnsi="Times New Roman Bold" w:cs="Times New Roman Bold"/>
-          <w:b/>
-          <w:bCs w:val="0"/>
-          <w:color w:val="auto"/>
-          <w:sz w:val="24"/>
-          <w:szCs w:val="24"/>
-        </w:rPr>
-        <w:instrText xml:space="preserve"> HYPERLINK "https://github.com/kxy-creator/PE6201-End-of-project" \h </w:instrText>
-      </w:r>
-      <w:r>
-        <w:rPr>
-          <w:rFonts w:hint="default" w:ascii="Times New Roman Bold" w:hAnsi="Times New Roman Bold" w:cs="Times New Roman Bold"/>
-          <w:b/>
-          <w:bCs w:val="0"/>
-          <w:color w:val="auto"/>
-          <w:sz w:val="24"/>
-          <w:szCs w:val="24"/>
-        </w:rPr>
-        <w:fldChar w:fldCharType="separate"/>
-      </w:r>
-      <w:r>
-        <w:rPr>
-          <w:rFonts w:hint="default" w:ascii="Times New Roman Bold" w:hAnsi="Times New Roman Bold" w:cs="Times New Roman Bold"/>
-          <w:b/>
-          <w:bCs w:val="0"/>
-          <w:color w:val="auto"/>
-          <w:sz w:val="24"/>
-          <w:szCs w:val="24"/>
-          <w:u w:val="single"/>
-        </w:rPr>
-        <w:t>https://github.com/kxy-creator/PE6201-End-of-project</w:t>
-      </w:r>
-      <w:r>
-        <w:rPr>
-          <w:rFonts w:hint="default" w:ascii="Times New Roman Bold" w:hAnsi="Times New Roman Bold" w:cs="Times New Roman Bold"/>
-          <w:b/>
-          <w:bCs w:val="0"/>
-          <w:color w:val="auto"/>
-          <w:sz w:val="24"/>
-          <w:szCs w:val="24"/>
-          <w:u w:val="single"/>
-        </w:rPr>
-        <w:fldChar w:fldCharType="end"/>
-      </w:r>
-      <w:r>
-        <w:rPr>
-          <w:rFonts w:hint="default" w:ascii="Times New Roman Bold" w:hAnsi="Times New Roman Bold" w:cs="Times New Roman Bold"/>
-          <w:b/>
-          <w:bCs w:val="0"/>
-          <w:color w:val="auto"/>
-          <w:sz w:val="24"/>
-          <w:szCs w:val="24"/>
-        </w:rPr>
-        <w:br w:type="textWrapping"/>
-      </w:r>
-      <w:r>
-        <w:rPr>
-          <w:rFonts w:hint="default" w:ascii="Times New Roman Regular" w:hAnsi="Times New Roman Regular" w:cs="Times New Roman Regular"/>
-          <w:b w:val="0"/>
-          <w:sz w:val="24"/>
-          <w:szCs w:val="24"/>
-        </w:rPr>
-        <w:t>Run python3 server.py and open http://127.0.0.1:8765. Run python3 -m unittest discover -s tests -v for regression checks. evaluate.py, compare.py and scripts/summarize_evidence.py reproduce the evidence summaries. Optional OpenRouter mode uses a local API key that is not stored in the repository.</w:t>
+        <w:t>The repository contains the policy corpus, labelled test cases, frozen evidence, source code, BPMN workflow and English demo video. The README defines the intended user, inputs, outputs, safety boundary and local setup. Repository: https://github.com/kxy-creator/PE6201-End-of-project</w:t>
+        <w:br/>
+        <w:t>Run python3 server.py and open http://127.0.0.1:8765. Run python3 -m unittest discover -s tests -v for regression checks. evaluate.py, compare.py and scripts/summarize_evidence.py reproduce the evidence summaries. The OpenRouter API model mode used in the recorded demonstration uses a local API key that is not stored in the repository.</w:t>
       </w:r>
     </w:p>
     <w:p>

</xml_diff>

<commit_message>
Fix repository link layout in final report
</commit_message>
<xml_diff>
--- a/docs/Final-Report-Kang Xingyao.docx
+++ b/docs/Final-Report-Kang Xingyao.docx
@@ -1514,8 +1514,26 @@
         </w:rPr>
       </w:pPr>
       <w:r>
-        <w:t>The repository contains the policy corpus, labelled test cases, frozen evidence, source code, BPMN workflow and English demo video. The README defines the intended user, inputs, outputs, safety boundary and local setup. Repository: https://github.com/kxy-creator/PE6201-End-of-project</w:t>
-        <w:br/>
+        <w:t>The repository contains the policy corpus, labelled test cases, frozen evidence, source code, BPMN workflow and English demo video. The README defines the intended user, inputs, outputs, safety boundary and local setup.</w:t>
+      </w:r>
+    </w:p>
+    <w:p>
+      <w:pPr>
+        <w:spacing w:before="60" w:after="60"/>
+        <w:ind w:firstLine="0"/>
+        <w:jc w:val="left"/>
+      </w:pPr>
+      <w:r>
+        <w:t>Repository: https://github.com/kxy-creator/PE6201-End-of-project</w:t>
+      </w:r>
+    </w:p>
+    <w:p>
+      <w:pPr>
+        <w:spacing w:before="0" w:after="0"/>
+        <w:ind w:firstLine="240"/>
+        <w:jc w:val="both"/>
+      </w:pPr>
+      <w:r>
         <w:t>Run python3 server.py and open http://127.0.0.1:8765. Run python3 -m unittest discover -s tests -v for regression checks. evaluate.py, compare.py and scripts/summarize_evidence.py reproduce the evidence summaries. The OpenRouter API model mode used in the recorded demonstration uses a local API key that is not stored in the repository.</w:t>
       </w:r>
     </w:p>

</xml_diff>

<commit_message>
Set report line spacing to one point five
</commit_message>
<xml_diff>
--- a/docs/Final-Report-Kang Xingyao.docx
+++ b/docs/Final-Report-Kang Xingyao.docx
@@ -358,7 +358,7 @@
     </w:p>
     <w:p>
       <w:pPr>
-        <w:spacing w:after="0" w:line="240" w:lineRule="auto"/>
+        <w:spacing w:after="0" w:line="360" w:lineRule="auto"/>
         <w:jc w:val="both"/>
         <w:rPr>
           <w:rFonts w:hint="default" w:ascii="Times New Roman Regular" w:hAnsi="Times New Roman Regular" w:cs="Times New Roman Regular"/>
@@ -961,6 +961,9 @@
             <w:vAlign w:val="center"/>
           </w:tcPr>
           <w:p>
+            <w:pPr>
+              <w:spacing w:line="360" w:lineRule="auto"/>
+            </w:pPr>
             <w:r>
               <w:t>My manual spot check</w:t>
             </w:r>
@@ -1519,7 +1522,7 @@
     </w:p>
     <w:p>
       <w:pPr>
-        <w:spacing w:before="60" w:after="60"/>
+        <w:spacing w:before="60" w:after="60" w:line="360" w:lineRule="auto"/>
         <w:ind w:firstLine="0"/>
         <w:jc w:val="left"/>
       </w:pPr>
@@ -1529,7 +1532,7 @@
     </w:p>
     <w:p>
       <w:pPr>
-        <w:spacing w:before="0" w:after="0"/>
+        <w:spacing w:before="0" w:after="0" w:line="360" w:lineRule="auto"/>
         <w:ind w:firstLine="240"/>
         <w:jc w:val="both"/>
       </w:pPr>

</xml_diff>